<commit_message>
Update all files to latest versions with infra health panel and state updates
Syncs working tree with latest code including PEP 604 type annotations,
infrastructure health dashboard panel, and updated state/handoff files
reflecting worker pod fix and current K8s deployment status.

Co-Authored-By: Claude Opus 4.6 <noreply@anthropic.com>
</commit_message>
<xml_diff>
--- a/APIS_Data_Dictionary.docx
+++ b/APIS_Data_Dictionary.docx
@@ -4620,9 +4620,15 @@
             <w:shd w:val="clear" w:color="auto" w:fill="F2F2F2"/>
           </w:tcPr>
           <w:p>
-            <w:r>
-              <w:rPr>
-                <w:sz w:val="20"/>
+            <w:pPr>
+              <w:rPr>
+                <w:lang w:val="es-ES"/>
+              </w:rPr>
+            </w:pPr>
+            <w:r>
+              <w:rPr>
+                <w:sz w:val="20"/>
+                <w:lang w:val="es-ES"/>
               </w:rPr>
               <w:t>/api/v1/portfolio/factor-exposure</w:t>
             </w:r>
@@ -13170,6 +13176,195 @@
       </w:tr>
     </w:tbl>
     <w:p/>
+    <w:p>
+      <w:pPr>
+        <w:pStyle w:val="Heading1"/>
+        <w:pageBreakBefore/>
+      </w:pPr>
+      <w:r>
+        <w:rPr>
+          <w:color w:val="1B2A4A"/>
+          <w:sz w:val="36"/>
+        </w:rPr>
+        <w:lastRenderedPageBreak/>
+        <w:t>8. System Operations</w:t>
+      </w:r>
+    </w:p>
+    <w:p>
+      <w:r>
+        <w:t>This section covers how to start and maintain APIS on a day-to-day basis.</w:t>
+      </w:r>
+    </w:p>
+    <w:p/>
+    <w:p>
+      <w:pPr>
+        <w:pStyle w:val="Heading2"/>
+      </w:pPr>
+      <w:r>
+        <w:rPr>
+          <w:color w:val="007B83"/>
+          <w:sz w:val="28"/>
+        </w:rPr>
+        <w:t>8.1 Daily Operation</w:t>
+      </w:r>
+    </w:p>
+    <w:p>
+      <w:r>
+        <w:t>Normally, nothing is required on a daily basis. Once all three services are running, the worker handles its own schedule automatically — ingesting data, generating signals, running paper trades, and producing reports at the times defined in its job schedule.</w:t>
+      </w:r>
+    </w:p>
+    <w:p>
+      <w:r>
+        <w:t xml:space="preserve">The only time action is required is after a </w:t>
+      </w:r>
+      <w:r>
+        <w:rPr>
+          <w:b/>
+        </w:rPr>
+        <w:t>reboot or log-out</w:t>
+      </w:r>
+      <w:r>
+        <w:t>, as described below.</w:t>
+      </w:r>
+    </w:p>
+    <w:p/>
+    <w:p>
+      <w:pPr>
+        <w:pStyle w:val="Heading2"/>
+      </w:pPr>
+      <w:r>
+        <w:rPr>
+          <w:color w:val="007B83"/>
+          <w:sz w:val="28"/>
+        </w:rPr>
+        <w:t>8.2 After a Reboot</w:t>
+      </w:r>
+    </w:p>
+    <w:p>
+      <w:r>
+        <w:t>After rebooting or logging back in, the following applies:</w:t>
+      </w:r>
+    </w:p>
+    <w:p>
+      <w:r>
+        <w:rPr>
+          <w:b/>
+        </w:rPr>
+        <w:t xml:space="preserve">Redis </w:t>
+      </w:r>
+      <w:r>
+        <w:t>— auto-starts on login via a shortcut in the Windows Startup folder. No action needed.</w:t>
+      </w:r>
+    </w:p>
+    <w:p>
+      <w:r>
+        <w:rPr>
+          <w:b/>
+        </w:rPr>
+        <w:t xml:space="preserve">PostgreSQL </w:t>
+      </w:r>
+      <w:r>
+        <w:t>— runs as a Windows service and auto-starts. No action needed.</w:t>
+      </w:r>
+    </w:p>
+    <w:p>
+      <w:r>
+        <w:rPr>
+          <w:b/>
+        </w:rPr>
+        <w:t xml:space="preserve">API and Worker </w:t>
+      </w:r>
+      <w:r>
+        <w:t>— must be started manually. Run each command below in its own terminal window.</w:t>
+      </w:r>
+    </w:p>
+    <w:p/>
+    <w:p>
+      <w:pPr>
+        <w:pStyle w:val="Heading2"/>
+      </w:pPr>
+      <w:r>
+        <w:rPr>
+          <w:color w:val="007B83"/>
+          <w:sz w:val="28"/>
+        </w:rPr>
+        <w:t>8.3 Start Commands</w:t>
+      </w:r>
+    </w:p>
+    <w:p>
+      <w:r>
+        <w:rPr>
+          <w:b/>
+        </w:rPr>
+        <w:t>API Server (Terminal Window 1)</w:t>
+      </w:r>
+    </w:p>
+    <w:p>
+      <w:pPr>
+        <w:ind w:left="720"/>
+      </w:pPr>
+      <w:r>
+        <w:rPr>
+          <w:rFonts w:ascii="Courier New" w:hAnsi="Courier New"/>
+          <w:color w:val="2B2B2B"/>
+          <w:sz w:val="18"/>
+          <w:shd w:val="clear" w:color="auto" w:fill="F2F2F2"/>
+        </w:rPr>
+        <w:t>cd /d C:\Users\aaron\OneDrive\Desktop\AI Projects\Auto Trade Bot\apis</w:t>
+      </w:r>
+    </w:p>
+    <w:p>
+      <w:pPr>
+        <w:ind w:left="720"/>
+      </w:pPr>
+      <w:r>
+        <w:rPr>
+          <w:rFonts w:ascii="Courier New" w:hAnsi="Courier New"/>
+          <w:color w:val="2B2B2B"/>
+          <w:sz w:val="18"/>
+          <w:shd w:val="clear" w:color="auto" w:fill="F2F2F2"/>
+        </w:rPr>
+        <w:t>.venv\Scripts\python.exe -m uvicorn apps.api.main:app --host 0.0.0.0 --port 8000</w:t>
+      </w:r>
+    </w:p>
+    <w:p/>
+    <w:p>
+      <w:r>
+        <w:rPr>
+          <w:b/>
+        </w:rPr>
+        <w:t>Worker (Terminal Window 2)</w:t>
+      </w:r>
+    </w:p>
+    <w:p>
+      <w:pPr>
+        <w:ind w:left="720"/>
+      </w:pPr>
+      <w:r>
+        <w:rPr>
+          <w:rFonts w:ascii="Courier New" w:hAnsi="Courier New"/>
+          <w:color w:val="2B2B2B"/>
+          <w:sz w:val="18"/>
+          <w:shd w:val="clear" w:color="auto" w:fill="F2F2F2"/>
+        </w:rPr>
+        <w:t>cd /d C:\Users\aaron\OneDrive\Desktop\AI Projects\Auto Trade Bot\apis</w:t>
+      </w:r>
+    </w:p>
+    <w:p>
+      <w:pPr>
+        <w:ind w:left="720"/>
+      </w:pPr>
+      <w:r>
+        <w:rPr>
+          <w:rFonts w:ascii="Courier New" w:hAnsi="Courier New"/>
+          <w:color w:val="2B2B2B"/>
+          <w:sz w:val="18"/>
+          <w:shd w:val="clear" w:color="auto" w:fill="F2F2F2"/>
+        </w:rPr>
+        <w:t>.venv\Scripts\python.exe -m apps.worker.main</w:t>
+      </w:r>
+    </w:p>
+    <w:p/>
     <w:sectPr>
       <w:pgSz w:w="12240" w:h="15840"/>
       <w:pgMar w:top="1440" w:right="1440" w:bottom="1440" w:left="1440" w:header="720" w:footer="720" w:gutter="0"/>
@@ -13335,7 +13530,7 @@
   <w:abstractNum w:abstractNumId="8" w15:restartNumberingAfterBreak="0">
     <w:nsid w:val="FFFFFF89"/>
     <w:multiLevelType w:val="singleLevel"/>
-    <w:tmpl w:val="29761A62"/>
+    <w:tmpl w:val="5EE03A8A"/>
     <w:lvl w:ilvl="0">
       <w:start w:val="1"/>
       <w:numFmt w:val="bullet"/>

</xml_diff>